<commit_message>
Sync from dietwebsite (CNAME preserved)
</commit_message>
<xml_diff>
--- a/diet-repo/diet-repo/diet-repo/diet-repo/diet-repo/reports/DIET-Chennai-Website-Audit.docx
+++ b/diet-repo/diet-repo/diet-repo/diet-repo/diet-repo/reports/DIET-Chennai-Website-Audit.docx
@@ -145,7 +145,7 @@
         <w:spacing w:after="160"/>
       </w:pPr>
       <w:r>
-        <w:t xml:space="preserve">The good news: the single biggest win — image compression — needs no architecture change and could cut total page weight by roughly 85% in an afternoon. Section 5 lays out a phased roadmap from these quick wins through to the structural changes an "enterprise-grade" government site needs.</w:t>
+        <w:t xml:space="preserve">The good news: the single biggest win — image compression — needs no architecture change and could cut total page weight by roughly 85% in an afternoon. Section 7 lays out a phased roadmap from these quick wins through to the structural changes an "enterprise-grade" government site needs, and Section 8 does the same for the admin/content-management side: the current CMS lets any editor publish any change to any of the site's 50 pages instantly, with no review step, no roles, and no audit trail an administrator can read without opening GitHub.</w:t>
       </w:r>
     </w:p>
     <w:p>
@@ -2582,7 +2582,7 @@
         <w:pStyle w:val="Heading1"/>
       </w:pPr>
       <w:r>
-        <w:t xml:space="preserve">8. Bottom line</w:t>
+        <w:t xml:space="preserve">8. Enterprise admin portal — proposed upgrade plan</w:t>
       </w:r>
     </w:p>
     <w:p>
@@ -2590,7 +2590,1670 @@
         <w:spacing w:after="160"/>
       </w:pPr>
       <w:r>
-        <w:t xml:space="preserve">Nothing found here requires abandoning the current static-HTML-on-GitHub-Pages approach, and most of Phase 0 can be done in a single sitting with no deployment risk. The highest-leverage single action is image compression — it is responsible for roughly 85% of the page's weight and needs no code restructuring at all. The highest-leverage structural action, once time allows, is moving off 80 copy-pasted HTML files onto shared templates — every bug this session had to hand-fix across 47+ files traces back to that one decision, and fixing it prevents the next several bugs like it rather than reacting to them one at a time.</w:t>
+        <w:t xml:space="preserve">The public site's technical debt is only half the picture. The other half is how content gets onto it: dietchennai.org is edited through Decap CMS at /admin, a git-based content editor that commits changes straight to the repository behind the live site. It works, and it is a genuine asset — non-technical staff can already edit announcements, circulars, and the photo gallery without touching HTML — but as configured today it has none of the controls an enterprise or government deployment is normally expected to have. This section documents those gaps directly from the CMS's own configuration file (admin/config.yml, 12 collections covering 67 editable targets) and lays out a phased upgrade that builds on the same Decap/GitHub stack rather than replacing it.</w:t>
+      </w:r>
+    </w:p>
+    <w:p>
+      <w:pPr>
+        <w:pStyle w:val="Heading2"/>
+      </w:pPr>
+      <w:r>
+        <w:t xml:space="preserve">8.1 Where the current admin experience falls short</w:t>
+      </w:r>
+    </w:p>
+    <w:p>
+      <w:pPr>
+        <w:spacing w:after="160"/>
+      </w:pPr>
+      <w:r>
+        <w:t xml:space="preserve">Found by direct inspection of admin/config.yml and admin/index.html, not by assumption:</w:t>
+      </w:r>
+    </w:p>
+    <w:p>
+      <w:pPr>
+        <w:pStyle w:val="ListParagraph"/>
+        <w:numPr>
+          <w:ilvl w:val="0"/>
+          <w:numId w:val="2"/>
+        </w:numPr>
+        <w:spacing w:after="90"/>
+      </w:pPr>
+      <w:r>
+        <w:rPr>
+          <w:b/>
+          <w:bCs/>
+        </w:rPr>
+        <w:t xml:space="preserve">Every editor is a full GitHub repository collaborator.</w:t>
+      </w:r>
+      <w:r>
+        <w:t xml:space="preserve"> The CMS backend (admin/config.yml, </w:t>
+      </w:r>
+      <w:r>
+        <w:rPr>
+          <w:rFonts w:ascii="Consolas" w:cs="Consolas" w:eastAsia="Consolas" w:hAnsi="Consolas"/>
+          <w:color w:val="8b3a00"/>
+          <w:sz w:val="20"/>
+          <w:szCs w:val="20"/>
+        </w:rPr>
+        <w:t xml:space="preserve">backend: name: github</w:t>
+      </w:r>
+      <w:r>
+        <w:t xml:space="preserve">) authenticates directly against GitHub with no Netlify Identity or Git Gateway layer in between. There is no way to grant someone "announcements only" access — adding an editor means adding them as a collaborator with write access to the entire code repository, not just its content.</w:t>
+      </w:r>
+    </w:p>
+    <w:p>
+      <w:pPr>
+        <w:pStyle w:val="ListParagraph"/>
+        <w:numPr>
+          <w:ilvl w:val="0"/>
+          <w:numId w:val="2"/>
+        </w:numPr>
+        <w:spacing w:after="90"/>
+      </w:pPr>
+      <w:r>
+        <w:rPr>
+          <w:b/>
+          <w:bCs/>
+        </w:rPr>
+        <w:t xml:space="preserve">No review step before publishing.</w:t>
+      </w:r>
+      <w:r>
+        <w:t xml:space="preserve"> </w:t>
+      </w:r>
+      <w:r>
+        <w:rPr>
+          <w:rFonts w:ascii="Consolas" w:cs="Consolas" w:eastAsia="Consolas" w:hAnsi="Consolas"/>
+          <w:color w:val="8b3a00"/>
+          <w:sz w:val="20"/>
+          <w:szCs w:val="20"/>
+        </w:rPr>
+        <w:t xml:space="preserve">editorial_workflow</w:t>
+      </w:r>
+      <w:r>
+        <w:t xml:space="preserve"> is not enabled. Every save on any of the 12 collections commits directly to the </w:t>
+      </w:r>
+      <w:r>
+        <w:rPr>
+          <w:rFonts w:ascii="Consolas" w:cs="Consolas" w:eastAsia="Consolas" w:hAnsi="Consolas"/>
+          <w:color w:val="8b3a00"/>
+          <w:sz w:val="20"/>
+          <w:szCs w:val="20"/>
+        </w:rPr>
+        <w:t xml:space="preserve">main</w:t>
+      </w:r>
+      <w:r>
+        <w:t xml:space="preserve"> branch and is live within minutes via GitHub Pages — there is no draft state, no second pair of eyes, and no scheduled publishing.</w:t>
+      </w:r>
+    </w:p>
+    <w:p>
+      <w:pPr>
+        <w:pStyle w:val="ListParagraph"/>
+        <w:numPr>
+          <w:ilvl w:val="0"/>
+          <w:numId w:val="2"/>
+        </w:numPr>
+        <w:spacing w:after="90"/>
+      </w:pPr>
+      <w:r>
+        <w:rPr>
+          <w:b/>
+          <w:bCs/>
+        </w:rPr>
+        <w:t xml:space="preserve">The riskiest collection is one click away from the safest ones.</w:t>
+      </w:r>
+      <w:r>
+        <w:t xml:space="preserve"> The "All Website Pages" collection exposes the raw HTML source of all 50 site pages for direct editing in the same interface as the safe, structured collections (announcements, circulars, gallery). The config file's own header comment already warns "editing raw HTML can break page layout if markup is deleted or malformed" — but nothing in the tool itself enforces that warning.</w:t>
+      </w:r>
+    </w:p>
+    <w:p>
+      <w:pPr>
+        <w:pStyle w:val="ListParagraph"/>
+        <w:numPr>
+          <w:ilvl w:val="0"/>
+          <w:numId w:val="2"/>
+        </w:numPr>
+        <w:spacing w:after="90"/>
+      </w:pPr>
+      <w:r>
+        <w:rPr>
+          <w:b/>
+          <w:bCs/>
+        </w:rPr>
+        <w:t xml:space="preserve">No role-based permissions.</w:t>
+      </w:r>
+      <w:r>
+        <w:t xml:space="preserve"> Decap's collection list is all-or-nothing: any collaborator who can open /admin can edit any of the 12 collections, from Announcements through to Site Settings and the raw HTML fallback. There is no "Content Editor" role distinct from a "Site Administrator" role.</w:t>
+      </w:r>
+    </w:p>
+    <w:p>
+      <w:pPr>
+        <w:pStyle w:val="ListParagraph"/>
+        <w:numPr>
+          <w:ilvl w:val="0"/>
+          <w:numId w:val="2"/>
+        </w:numPr>
+        <w:spacing w:after="90"/>
+      </w:pPr>
+      <w:r>
+        <w:rPr>
+          <w:b/>
+          <w:bCs/>
+        </w:rPr>
+        <w:t xml:space="preserve">No audit trail a non-developer can read.</w:t>
+      </w:r>
+      <w:r>
+        <w:t xml:space="preserve"> The only change history is the git commit log. Answering "who changed the Last Updated date, and when" today requires opening GitHub and reading commit history — not something a Principal or nodal officer can reasonably be expected to do.</w:t>
+      </w:r>
+    </w:p>
+    <w:p>
+      <w:pPr>
+        <w:pStyle w:val="ListParagraph"/>
+        <w:numPr>
+          <w:ilvl w:val="0"/>
+          <w:numId w:val="2"/>
+        </w:numPr>
+        <w:spacing w:after="90"/>
+      </w:pPr>
+      <w:r>
+        <w:rPr>
+          <w:b/>
+          <w:bCs/>
+        </w:rPr>
+        <w:t xml:space="preserve">No dashboard.</w:t>
+      </w:r>
+      <w:r>
+        <w:t xml:space="preserve"> The default admin screen is a flat list of 12 collections with no summary of recent changes, pending edits, or overall site health.</w:t>
+      </w:r>
+    </w:p>
+    <w:p>
+      <w:pPr>
+        <w:pStyle w:val="ListParagraph"/>
+        <w:numPr>
+          <w:ilvl w:val="0"/>
+          <w:numId w:val="2"/>
+        </w:numPr>
+        <w:spacing w:after="90"/>
+      </w:pPr>
+      <w:r>
+        <w:rPr>
+          <w:b/>
+          <w:bCs/>
+        </w:rPr>
+        <w:t xml:space="preserve">No media governance at upload time.</w:t>
+      </w:r>
+      <w:r>
+        <w:t xml:space="preserve"> Collections that accept file/image uploads write directly into </w:t>
+      </w:r>
+      <w:r>
+        <w:rPr>
+          <w:rFonts w:ascii="Consolas" w:cs="Consolas" w:eastAsia="Consolas" w:hAnsi="Consolas"/>
+          <w:color w:val="8b3a00"/>
+          <w:sz w:val="20"/>
+          <w:szCs w:val="20"/>
+        </w:rPr>
+        <w:t xml:space="preserve">images/</w:t>
+      </w:r>
+      <w:r>
+        <w:t xml:space="preserve"> with no size, dimension, or format check. This is the same gap that let the 3.39 MB and 3.23 MB banner images and the 1.39 MB partner-logo icon reach production in the first place (Section 3.1) — nothing stops the next oversized upload either.</w:t>
+      </w:r>
+    </w:p>
+    <w:p>
+      <w:pPr>
+        <w:pStyle w:val="Heading2"/>
+      </w:pPr>
+      <w:r>
+        <w:t xml:space="preserve">8.2 Proposed upgrade — phased, on the existing Decap/GitHub stack</w:t>
+      </w:r>
+    </w:p>
+    <w:p>
+      <w:pPr>
+        <w:spacing w:after="160"/>
+      </w:pPr>
+      <w:r>
+        <w:t xml:space="preserve">As with the technical roadmap in Section 7, none of this requires leaving Decap CMS, GitHub, or GitHub Pages. The upgrade is about turning on and building around capabilities the current stack already supports.</w:t>
+      </w:r>
+    </w:p>
+    <w:p>
+      <w:pPr>
+        <w:pStyle w:val="Heading3"/>
+      </w:pPr>
+      <w:r>
+        <w:t xml:space="preserve">Phase A — configuration-level, 1–2 weeks, no new infrastructure</w:t>
+      </w:r>
+    </w:p>
+    <w:p>
+      <w:pPr>
+        <w:pStyle w:val="ListParagraph"/>
+        <w:numPr>
+          <w:ilvl w:val="0"/>
+          <w:numId w:val="2"/>
+        </w:numPr>
+        <w:spacing w:after="90"/>
+      </w:pPr>
+      <w:r>
+        <w:rPr>
+          <w:b/>
+          <w:bCs/>
+        </w:rPr>
+        <w:t xml:space="preserve">Enable </w:t>
+      </w:r>
+      <w:r>
+        <w:rPr>
+          <w:rFonts w:ascii="Consolas" w:cs="Consolas" w:eastAsia="Consolas" w:hAnsi="Consolas"/>
+          <w:color w:val="8b3a00"/>
+          <w:sz w:val="20"/>
+          <w:szCs w:val="20"/>
+        </w:rPr>
+        <w:t xml:space="preserve">editorial_workflow: true</w:t>
+      </w:r>
+      <w:r>
+        <w:t xml:space="preserve"> in admin/config.yml.</w:t>
+      </w:r>
+      <w:r>
+        <w:t xml:space="preserve"> A one-line config change that turns every save into a real pull request with Draft / In Review / Ready workflow states and a built-in status board — a genuine review gate, with zero new hosting.</w:t>
+      </w:r>
+    </w:p>
+    <w:p>
+      <w:pPr>
+        <w:pStyle w:val="ListParagraph"/>
+        <w:numPr>
+          <w:ilvl w:val="0"/>
+          <w:numId w:val="2"/>
+        </w:numPr>
+        <w:spacing w:after="90"/>
+      </w:pPr>
+      <w:r>
+        <w:rPr>
+          <w:b/>
+          <w:bCs/>
+        </w:rPr>
+        <w:t xml:space="preserve">Move from direct GitHub OAuth to Netlify Identity + Git Gateway.</w:t>
+      </w:r>
+      <w:r>
+        <w:t xml:space="preserve"> Lets editors be invited by email with an assigned role, instead of being added as a GitHub repository collaborator with full code access — and enables restricting which roles can see which collections.</w:t>
+      </w:r>
+    </w:p>
+    <w:p>
+      <w:pPr>
+        <w:pStyle w:val="ListParagraph"/>
+        <w:numPr>
+          <w:ilvl w:val="0"/>
+          <w:numId w:val="2"/>
+        </w:numPr>
+        <w:spacing w:after="90"/>
+      </w:pPr>
+      <w:r>
+        <w:rPr>
+          <w:b/>
+          <w:bCs/>
+        </w:rPr>
+        <w:t xml:space="preserve">Split the raw-HTML "All Website Pages" collection out of day-to-day view.</w:t>
+      </w:r>
+      <w:r>
+        <w:t xml:space="preserve"> Restrict it to a Site Administrator Identity role so ordinary content editors never see the 50 files that can break page layout if mishandled.</w:t>
+      </w:r>
+    </w:p>
+    <w:p>
+      <w:pPr>
+        <w:pStyle w:val="ListParagraph"/>
+        <w:numPr>
+          <w:ilvl w:val="0"/>
+          <w:numId w:val="2"/>
+        </w:numPr>
+        <w:spacing w:after="90"/>
+      </w:pPr>
+      <w:r>
+        <w:rPr>
+          <w:b/>
+          <w:bCs/>
+        </w:rPr>
+        <w:t xml:space="preserve">Add a GitHub Action that runs on every content pull request</w:t>
+      </w:r>
+      <w:r>
+        <w:t xml:space="preserve"> (made possible once Phase A's editorial workflow is on) to auto-convert and resize any newly uploaded image to WebP under a size budget before it can be merged — closes the image-governance gap where content enters the system, rather than relying on after-the-fact cleanup like Section 7's Phase 0.</w:t>
+      </w:r>
+    </w:p>
+    <w:p>
+      <w:pPr>
+        <w:pStyle w:val="Heading3"/>
+      </w:pPr>
+      <w:r>
+        <w:t xml:space="preserve">Phase B — a real admin dashboard, 4–8 weeks</w:t>
+      </w:r>
+    </w:p>
+    <w:p>
+      <w:pPr>
+        <w:pStyle w:val="ListParagraph"/>
+        <w:numPr>
+          <w:ilvl w:val="0"/>
+          <w:numId w:val="2"/>
+        </w:numPr>
+        <w:spacing w:after="90"/>
+      </w:pPr>
+      <w:r>
+        <w:rPr>
+          <w:b/>
+          <w:bCs/>
+        </w:rPr>
+        <w:t xml:space="preserve">Build a single "Admin Home" screen.</w:t>
+      </w:r>
+      <w:r>
+        <w:t xml:space="preserve"> A small custom page alongside /admin surfacing: items awaiting review (from the Phase A workflow queue), announcements/circulars approaching their listed date, and the latest results from the Section 7.3 CI quality gate (Lighthouse budget, broken-link check) — site health visible without opening GitHub or DevTools.</w:t>
+      </w:r>
+    </w:p>
+    <w:p>
+      <w:pPr>
+        <w:pStyle w:val="ListParagraph"/>
+        <w:numPr>
+          <w:ilvl w:val="0"/>
+          <w:numId w:val="2"/>
+        </w:numPr>
+        <w:spacing w:after="90"/>
+      </w:pPr>
+      <w:r>
+        <w:rPr>
+          <w:b/>
+          <w:bCs/>
+        </w:rPr>
+        <w:t xml:space="preserve">Add a read-only, in-CMS audit log.</w:t>
+      </w:r>
+      <w:r>
+        <w:t xml:space="preserve"> Render the git history for the content-data files (assets/content/data/*.json, assets/content/gallery/*) as a plain-language activity feed, so "who changed what, and when" is answerable directly by an administrator.</w:t>
+      </w:r>
+    </w:p>
+    <w:p>
+      <w:pPr>
+        <w:pStyle w:val="ListParagraph"/>
+        <w:numPr>
+          <w:ilvl w:val="0"/>
+          <w:numId w:val="2"/>
+        </w:numPr>
+        <w:spacing w:after="90"/>
+      </w:pPr>
+      <w:r>
+        <w:rPr>
+          <w:b/>
+          <w:bCs/>
+        </w:rPr>
+        <w:t xml:space="preserve">Formalize three access roles</w:t>
+      </w:r>
+      <w:r>
+        <w:t xml:space="preserve"> matched to how the institution is actually staffed, mapped onto the Identity roles introduced in Phase A: Content Editor (announcements, circulars, downloads, gallery), Section/Department Owner (their own department's fields only), and Site Administrator (raw HTML fallback, Site Settings, and user/role management).</w:t>
+      </w:r>
+    </w:p>
+    <w:p>
+      <w:pPr>
+        <w:pStyle w:val="ListParagraph"/>
+        <w:numPr>
+          <w:ilvl w:val="0"/>
+          <w:numId w:val="2"/>
+        </w:numPr>
+        <w:spacing w:after="90"/>
+      </w:pPr>
+      <w:r>
+        <w:rPr>
+          <w:b/>
+          <w:bCs/>
+        </w:rPr>
+        <w:t xml:space="preserve">Add date-gated scheduled publishing</w:t>
+      </w:r>
+      <w:r>
+        <w:t xml:space="preserve"> for announcements and circulars — a GitHub Action that only exposes an item once its date field has passed, removing the need to remember to publish time-sensitive notices manually.</w:t>
+      </w:r>
+    </w:p>
+    <w:p>
+      <w:pPr>
+        <w:pStyle w:val="Heading3"/>
+      </w:pPr>
+      <w:r>
+        <w:t xml:space="preserve">Phase C — full headless-CMS evaluation (optional, needs-driven)</w:t>
+      </w:r>
+    </w:p>
+    <w:p>
+      <w:pPr>
+        <w:spacing w:after="160"/>
+      </w:pPr>
+      <w:r>
+        <w:t xml:space="preserve">A dedicated headless CMS (Strapi, Payload, or Directus) would give database-backed role permissions, a full native audit trail, and scheduled publishing out of the box, without any of the config-level plumbing Phases A and B require. The honest trade-off: it reintroduces a server and database that Section 6 and Section 7.3 deliberately avoid for the public-facing site. Because that server would only run behind the admin login at content-authoring time — never serving public traffic — it would not compromise the public site's static-hosting security posture from Section 5.3, but it is a new system to host, secure, and maintain, with its own recurring cost. Evaluate this route only if Phases A and B, tried in practice, prove insufficient for how the institution actually works.</w:t>
+      </w:r>
+    </w:p>
+    <w:p>
+      <w:pPr>
+        <w:spacing w:after="40"/>
+      </w:pPr>
+      <w:r>
+        <w:t xml:space="preserve"/>
+      </w:r>
+    </w:p>
+    <w:tbl>
+      <w:tblPr>
+        <w:tblW w:type="dxa" w:w="9500"/>
+        <w:tblBorders>
+          <w:top w:val="single" w:color="auto" w:sz="4"/>
+          <w:left w:val="single" w:color="auto" w:sz="4"/>
+          <w:bottom w:val="single" w:color="auto" w:sz="4"/>
+          <w:right w:val="single" w:color="auto" w:sz="4"/>
+          <w:insideH w:val="single" w:color="auto" w:sz="4"/>
+          <w:insideV w:val="single" w:color="auto" w:sz="4"/>
+        </w:tblBorders>
+      </w:tblPr>
+      <w:tblGrid>
+        <w:gridCol w:w="1900"/>
+        <w:gridCol w:w="1750"/>
+        <w:gridCol w:w="1750"/>
+        <w:gridCol w:w="1750"/>
+        <w:gridCol w:w="2350"/>
+      </w:tblGrid>
+      <w:tr>
+        <w:trPr>
+          <w:tblHeader/>
+        </w:trPr>
+        <w:tc>
+          <w:tcPr>
+            <w:tcW w:type="dxa" w:w="1900"/>
+            <w:shd w:fill="0a4168" w:val="clear"/>
+            <w:tcMar>
+              <w:top w:type="dxa" w:w="80"/>
+              <w:left w:type="dxa" w:w="100"/>
+              <w:bottom w:type="dxa" w:w="80"/>
+              <w:right w:type="dxa" w:w="100"/>
+            </w:tcMar>
+          </w:tcPr>
+          <w:p>
+            <w:r>
+              <w:rPr>
+                <w:b/>
+                <w:bCs/>
+                <w:i w:val="false"/>
+                <w:iCs w:val="false"/>
+                <w:color w:val="FFFFFF"/>
+                <w:sz w:val="19"/>
+                <w:szCs w:val="19"/>
+              </w:rPr>
+              <w:t xml:space="preserve">Capability</w:t>
+            </w:r>
+          </w:p>
+        </w:tc>
+        <w:tc>
+          <w:tcPr>
+            <w:tcW w:type="dxa" w:w="1750"/>
+            <w:shd w:fill="0a4168" w:val="clear"/>
+            <w:tcMar>
+              <w:top w:type="dxa" w:w="80"/>
+              <w:left w:type="dxa" w:w="100"/>
+              <w:bottom w:type="dxa" w:w="80"/>
+              <w:right w:type="dxa" w:w="100"/>
+            </w:tcMar>
+          </w:tcPr>
+          <w:p>
+            <w:r>
+              <w:rPr>
+                <w:b/>
+                <w:bCs/>
+                <w:i w:val="false"/>
+                <w:iCs w:val="false"/>
+                <w:color w:val="FFFFFF"/>
+                <w:sz w:val="19"/>
+                <w:szCs w:val="19"/>
+              </w:rPr>
+              <w:t xml:space="preserve">Current</w:t>
+            </w:r>
+          </w:p>
+        </w:tc>
+        <w:tc>
+          <w:tcPr>
+            <w:tcW w:type="dxa" w:w="1750"/>
+            <w:shd w:fill="0a4168" w:val="clear"/>
+            <w:tcMar>
+              <w:top w:type="dxa" w:w="80"/>
+              <w:left w:type="dxa" w:w="100"/>
+              <w:bottom w:type="dxa" w:w="80"/>
+              <w:right w:type="dxa" w:w="100"/>
+            </w:tcMar>
+          </w:tcPr>
+          <w:p>
+            <w:r>
+              <w:rPr>
+                <w:b/>
+                <w:bCs/>
+                <w:i w:val="false"/>
+                <w:iCs w:val="false"/>
+                <w:color w:val="FFFFFF"/>
+                <w:sz w:val="19"/>
+                <w:szCs w:val="19"/>
+              </w:rPr>
+              <w:t xml:space="preserve">Phase A</w:t>
+            </w:r>
+          </w:p>
+        </w:tc>
+        <w:tc>
+          <w:tcPr>
+            <w:tcW w:type="dxa" w:w="1750"/>
+            <w:shd w:fill="0a4168" w:val="clear"/>
+            <w:tcMar>
+              <w:top w:type="dxa" w:w="80"/>
+              <w:left w:type="dxa" w:w="100"/>
+              <w:bottom w:type="dxa" w:w="80"/>
+              <w:right w:type="dxa" w:w="100"/>
+            </w:tcMar>
+          </w:tcPr>
+          <w:p>
+            <w:r>
+              <w:rPr>
+                <w:b/>
+                <w:bCs/>
+                <w:i w:val="false"/>
+                <w:iCs w:val="false"/>
+                <w:color w:val="FFFFFF"/>
+                <w:sz w:val="19"/>
+                <w:szCs w:val="19"/>
+              </w:rPr>
+              <w:t xml:space="preserve">Phase B</w:t>
+            </w:r>
+          </w:p>
+        </w:tc>
+        <w:tc>
+          <w:tcPr>
+            <w:tcW w:type="dxa" w:w="2350"/>
+            <w:shd w:fill="0a4168" w:val="clear"/>
+            <w:tcMar>
+              <w:top w:type="dxa" w:w="80"/>
+              <w:left w:type="dxa" w:w="100"/>
+              <w:bottom w:type="dxa" w:w="80"/>
+              <w:right w:type="dxa" w:w="100"/>
+            </w:tcMar>
+          </w:tcPr>
+          <w:p>
+            <w:r>
+              <w:rPr>
+                <w:b/>
+                <w:bCs/>
+                <w:i w:val="false"/>
+                <w:iCs w:val="false"/>
+                <w:color w:val="FFFFFF"/>
+                <w:sz w:val="19"/>
+                <w:szCs w:val="19"/>
+              </w:rPr>
+              <w:t xml:space="preserve">Phase C</w:t>
+            </w:r>
+          </w:p>
+        </w:tc>
+      </w:tr>
+      <w:tr>
+        <w:tc>
+          <w:tcPr>
+            <w:tcW w:type="dxa" w:w="1900"/>
+            <w:tcMar>
+              <w:top w:type="dxa" w:w="80"/>
+              <w:left w:type="dxa" w:w="100"/>
+              <w:bottom w:type="dxa" w:w="80"/>
+              <w:right w:type="dxa" w:w="100"/>
+            </w:tcMar>
+          </w:tcPr>
+          <w:p>
+            <w:r>
+              <w:rPr>
+                <w:b w:val="false"/>
+                <w:bCs w:val="false"/>
+                <w:i w:val="false"/>
+                <w:iCs w:val="false"/>
+                <w:color w:val="000000"/>
+                <w:sz w:val="19"/>
+                <w:szCs w:val="19"/>
+              </w:rPr>
+              <w:t xml:space="preserve">Review before publish</w:t>
+            </w:r>
+          </w:p>
+        </w:tc>
+        <w:tc>
+          <w:tcPr>
+            <w:tcW w:type="dxa" w:w="1750"/>
+            <w:tcMar>
+              <w:top w:type="dxa" w:w="80"/>
+              <w:left w:type="dxa" w:w="100"/>
+              <w:bottom w:type="dxa" w:w="80"/>
+              <w:right w:type="dxa" w:w="100"/>
+            </w:tcMar>
+          </w:tcPr>
+          <w:p>
+            <w:r>
+              <w:rPr>
+                <w:b w:val="false"/>
+                <w:bCs w:val="false"/>
+                <w:i w:val="false"/>
+                <w:iCs w:val="false"/>
+                <w:color w:val="000000"/>
+                <w:sz w:val="19"/>
+                <w:szCs w:val="19"/>
+              </w:rPr>
+              <w:t xml:space="preserve">None — saves go live immediately</w:t>
+            </w:r>
+          </w:p>
+        </w:tc>
+        <w:tc>
+          <w:tcPr>
+            <w:tcW w:type="dxa" w:w="1750"/>
+            <w:tcMar>
+              <w:top w:type="dxa" w:w="80"/>
+              <w:left w:type="dxa" w:w="100"/>
+              <w:bottom w:type="dxa" w:w="80"/>
+              <w:right w:type="dxa" w:w="100"/>
+            </w:tcMar>
+          </w:tcPr>
+          <w:p>
+            <w:r>
+              <w:rPr>
+                <w:b w:val="false"/>
+                <w:bCs w:val="false"/>
+                <w:i w:val="false"/>
+                <w:iCs w:val="false"/>
+                <w:color w:val="000000"/>
+                <w:sz w:val="19"/>
+                <w:szCs w:val="19"/>
+              </w:rPr>
+              <w:t xml:space="preserve">Draft → Review → Ready</w:t>
+            </w:r>
+          </w:p>
+        </w:tc>
+        <w:tc>
+          <w:tcPr>
+            <w:tcW w:type="dxa" w:w="1750"/>
+            <w:tcMar>
+              <w:top w:type="dxa" w:w="80"/>
+              <w:left w:type="dxa" w:w="100"/>
+              <w:bottom w:type="dxa" w:w="80"/>
+              <w:right w:type="dxa" w:w="100"/>
+            </w:tcMar>
+          </w:tcPr>
+          <w:p>
+            <w:r>
+              <w:rPr>
+                <w:b w:val="false"/>
+                <w:bCs w:val="false"/>
+                <w:i w:val="false"/>
+                <w:iCs w:val="false"/>
+                <w:color w:val="000000"/>
+                <w:sz w:val="19"/>
+                <w:szCs w:val="19"/>
+              </w:rPr>
+              <w:t xml:space="preserve">Same, plus dashboard visibility</w:t>
+            </w:r>
+          </w:p>
+        </w:tc>
+        <w:tc>
+          <w:tcPr>
+            <w:tcW w:type="dxa" w:w="2350"/>
+            <w:tcMar>
+              <w:top w:type="dxa" w:w="80"/>
+              <w:left w:type="dxa" w:w="100"/>
+              <w:bottom w:type="dxa" w:w="80"/>
+              <w:right w:type="dxa" w:w="100"/>
+            </w:tcMar>
+          </w:tcPr>
+          <w:p>
+            <w:r>
+              <w:rPr>
+                <w:b w:val="false"/>
+                <w:bCs w:val="false"/>
+                <w:i w:val="false"/>
+                <w:iCs w:val="false"/>
+                <w:color w:val="000000"/>
+                <w:sz w:val="19"/>
+                <w:szCs w:val="19"/>
+              </w:rPr>
+              <w:t xml:space="preserve">Same, plus multi-step approval</w:t>
+            </w:r>
+          </w:p>
+        </w:tc>
+      </w:tr>
+      <w:tr>
+        <w:tc>
+          <w:tcPr>
+            <w:tcW w:type="dxa" w:w="1900"/>
+            <w:shd w:fill="f2f2f2" w:val="clear"/>
+            <w:tcMar>
+              <w:top w:type="dxa" w:w="80"/>
+              <w:left w:type="dxa" w:w="100"/>
+              <w:bottom w:type="dxa" w:w="80"/>
+              <w:right w:type="dxa" w:w="100"/>
+            </w:tcMar>
+          </w:tcPr>
+          <w:p>
+            <w:r>
+              <w:rPr>
+                <w:b w:val="false"/>
+                <w:bCs w:val="false"/>
+                <w:i w:val="false"/>
+                <w:iCs w:val="false"/>
+                <w:color w:val="000000"/>
+                <w:sz w:val="19"/>
+                <w:szCs w:val="19"/>
+              </w:rPr>
+              <w:t xml:space="preserve">Editor access model</w:t>
+            </w:r>
+          </w:p>
+        </w:tc>
+        <w:tc>
+          <w:tcPr>
+            <w:tcW w:type="dxa" w:w="1750"/>
+            <w:shd w:fill="f2f2f2" w:val="clear"/>
+            <w:tcMar>
+              <w:top w:type="dxa" w:w="80"/>
+              <w:left w:type="dxa" w:w="100"/>
+              <w:bottom w:type="dxa" w:w="80"/>
+              <w:right w:type="dxa" w:w="100"/>
+            </w:tcMar>
+          </w:tcPr>
+          <w:p>
+            <w:r>
+              <w:rPr>
+                <w:b w:val="false"/>
+                <w:bCs w:val="false"/>
+                <w:i w:val="false"/>
+                <w:iCs w:val="false"/>
+                <w:color w:val="000000"/>
+                <w:sz w:val="19"/>
+                <w:szCs w:val="19"/>
+              </w:rPr>
+              <w:t xml:space="preserve">GitHub collaborator (full repo access)</w:t>
+            </w:r>
+          </w:p>
+        </w:tc>
+        <w:tc>
+          <w:tcPr>
+            <w:tcW w:type="dxa" w:w="1750"/>
+            <w:shd w:fill="f2f2f2" w:val="clear"/>
+            <w:tcMar>
+              <w:top w:type="dxa" w:w="80"/>
+              <w:left w:type="dxa" w:w="100"/>
+              <w:bottom w:type="dxa" w:w="80"/>
+              <w:right w:type="dxa" w:w="100"/>
+            </w:tcMar>
+          </w:tcPr>
+          <w:p>
+            <w:r>
+              <w:rPr>
+                <w:b w:val="false"/>
+                <w:bCs w:val="false"/>
+                <w:i w:val="false"/>
+                <w:iCs w:val="false"/>
+                <w:color w:val="000000"/>
+                <w:sz w:val="19"/>
+                <w:szCs w:val="19"/>
+              </w:rPr>
+              <w:t xml:space="preserve">Identity invite by email</w:t>
+            </w:r>
+          </w:p>
+        </w:tc>
+        <w:tc>
+          <w:tcPr>
+            <w:tcW w:type="dxa" w:w="1750"/>
+            <w:shd w:fill="f2f2f2" w:val="clear"/>
+            <w:tcMar>
+              <w:top w:type="dxa" w:w="80"/>
+              <w:left w:type="dxa" w:w="100"/>
+              <w:bottom w:type="dxa" w:w="80"/>
+              <w:right w:type="dxa" w:w="100"/>
+            </w:tcMar>
+          </w:tcPr>
+          <w:p>
+            <w:r>
+              <w:rPr>
+                <w:b w:val="false"/>
+                <w:bCs w:val="false"/>
+                <w:i w:val="false"/>
+                <w:iCs w:val="false"/>
+                <w:color w:val="000000"/>
+                <w:sz w:val="19"/>
+                <w:szCs w:val="19"/>
+              </w:rPr>
+              <w:t xml:space="preserve">Same</w:t>
+            </w:r>
+          </w:p>
+        </w:tc>
+        <w:tc>
+          <w:tcPr>
+            <w:tcW w:type="dxa" w:w="2350"/>
+            <w:shd w:fill="f2f2f2" w:val="clear"/>
+            <w:tcMar>
+              <w:top w:type="dxa" w:w="80"/>
+              <w:left w:type="dxa" w:w="100"/>
+              <w:bottom w:type="dxa" w:w="80"/>
+              <w:right w:type="dxa" w:w="100"/>
+            </w:tcMar>
+          </w:tcPr>
+          <w:p>
+            <w:r>
+              <w:rPr>
+                <w:b w:val="false"/>
+                <w:bCs w:val="false"/>
+                <w:i w:val="false"/>
+                <w:iCs w:val="false"/>
+                <w:color w:val="000000"/>
+                <w:sz w:val="19"/>
+                <w:szCs w:val="19"/>
+              </w:rPr>
+              <w:t xml:space="preserve">Native user management, SSO-ready</w:t>
+            </w:r>
+          </w:p>
+        </w:tc>
+      </w:tr>
+      <w:tr>
+        <w:tc>
+          <w:tcPr>
+            <w:tcW w:type="dxa" w:w="1900"/>
+            <w:tcMar>
+              <w:top w:type="dxa" w:w="80"/>
+              <w:left w:type="dxa" w:w="100"/>
+              <w:bottom w:type="dxa" w:w="80"/>
+              <w:right w:type="dxa" w:w="100"/>
+            </w:tcMar>
+          </w:tcPr>
+          <w:p>
+            <w:r>
+              <w:rPr>
+                <w:b w:val="false"/>
+                <w:bCs w:val="false"/>
+                <w:i w:val="false"/>
+                <w:iCs w:val="false"/>
+                <w:color w:val="000000"/>
+                <w:sz w:val="19"/>
+                <w:szCs w:val="19"/>
+              </w:rPr>
+              <w:t xml:space="preserve">Role-based permissions</w:t>
+            </w:r>
+          </w:p>
+        </w:tc>
+        <w:tc>
+          <w:tcPr>
+            <w:tcW w:type="dxa" w:w="1750"/>
+            <w:tcMar>
+              <w:top w:type="dxa" w:w="80"/>
+              <w:left w:type="dxa" w:w="100"/>
+              <w:bottom w:type="dxa" w:w="80"/>
+              <w:right w:type="dxa" w:w="100"/>
+            </w:tcMar>
+          </w:tcPr>
+          <w:p>
+            <w:r>
+              <w:rPr>
+                <w:b w:val="false"/>
+                <w:bCs w:val="false"/>
+                <w:i w:val="false"/>
+                <w:iCs w:val="false"/>
+                <w:color w:val="000000"/>
+                <w:sz w:val="19"/>
+                <w:szCs w:val="19"/>
+              </w:rPr>
+              <w:t xml:space="preserve">None — all or nothing</w:t>
+            </w:r>
+          </w:p>
+        </w:tc>
+        <w:tc>
+          <w:tcPr>
+            <w:tcW w:type="dxa" w:w="1750"/>
+            <w:tcMar>
+              <w:top w:type="dxa" w:w="80"/>
+              <w:left w:type="dxa" w:w="100"/>
+              <w:bottom w:type="dxa" w:w="80"/>
+              <w:right w:type="dxa" w:w="100"/>
+            </w:tcMar>
+          </w:tcPr>
+          <w:p>
+            <w:r>
+              <w:rPr>
+                <w:b w:val="false"/>
+                <w:bCs w:val="false"/>
+                <w:i w:val="false"/>
+                <w:iCs w:val="false"/>
+                <w:color w:val="000000"/>
+                <w:sz w:val="19"/>
+                <w:szCs w:val="19"/>
+              </w:rPr>
+              <w:t xml:space="preserve">Collection-level via Identity roles</w:t>
+            </w:r>
+          </w:p>
+        </w:tc>
+        <w:tc>
+          <w:tcPr>
+            <w:tcW w:type="dxa" w:w="1750"/>
+            <w:tcMar>
+              <w:top w:type="dxa" w:w="80"/>
+              <w:left w:type="dxa" w:w="100"/>
+              <w:bottom w:type="dxa" w:w="80"/>
+              <w:right w:type="dxa" w:w="100"/>
+            </w:tcMar>
+          </w:tcPr>
+          <w:p>
+            <w:r>
+              <w:rPr>
+                <w:b w:val="false"/>
+                <w:bCs w:val="false"/>
+                <w:i w:val="false"/>
+                <w:iCs w:val="false"/>
+                <w:color w:val="000000"/>
+                <w:sz w:val="19"/>
+                <w:szCs w:val="19"/>
+              </w:rPr>
+              <w:t xml:space="preserve">3 defined roles</w:t>
+            </w:r>
+          </w:p>
+        </w:tc>
+        <w:tc>
+          <w:tcPr>
+            <w:tcW w:type="dxa" w:w="2350"/>
+            <w:tcMar>
+              <w:top w:type="dxa" w:w="80"/>
+              <w:left w:type="dxa" w:w="100"/>
+              <w:bottom w:type="dxa" w:w="80"/>
+              <w:right w:type="dxa" w:w="100"/>
+            </w:tcMar>
+          </w:tcPr>
+          <w:p>
+            <w:r>
+              <w:rPr>
+                <w:b w:val="false"/>
+                <w:bCs w:val="false"/>
+                <w:i w:val="false"/>
+                <w:iCs w:val="false"/>
+                <w:color w:val="000000"/>
+                <w:sz w:val="19"/>
+                <w:szCs w:val="19"/>
+              </w:rPr>
+              <w:t xml:space="preserve">Field-level, native</w:t>
+            </w:r>
+          </w:p>
+        </w:tc>
+      </w:tr>
+      <w:tr>
+        <w:tc>
+          <w:tcPr>
+            <w:tcW w:type="dxa" w:w="1900"/>
+            <w:shd w:fill="f2f2f2" w:val="clear"/>
+            <w:tcMar>
+              <w:top w:type="dxa" w:w="80"/>
+              <w:left w:type="dxa" w:w="100"/>
+              <w:bottom w:type="dxa" w:w="80"/>
+              <w:right w:type="dxa" w:w="100"/>
+            </w:tcMar>
+          </w:tcPr>
+          <w:p>
+            <w:r>
+              <w:rPr>
+                <w:b w:val="false"/>
+                <w:bCs w:val="false"/>
+                <w:i w:val="false"/>
+                <w:iCs w:val="false"/>
+                <w:color w:val="000000"/>
+                <w:sz w:val="19"/>
+                <w:szCs w:val="19"/>
+              </w:rPr>
+              <w:t xml:space="preserve">Audit trail</w:t>
+            </w:r>
+          </w:p>
+        </w:tc>
+        <w:tc>
+          <w:tcPr>
+            <w:tcW w:type="dxa" w:w="1750"/>
+            <w:shd w:fill="f2f2f2" w:val="clear"/>
+            <w:tcMar>
+              <w:top w:type="dxa" w:w="80"/>
+              <w:left w:type="dxa" w:w="100"/>
+              <w:bottom w:type="dxa" w:w="80"/>
+              <w:right w:type="dxa" w:w="100"/>
+            </w:tcMar>
+          </w:tcPr>
+          <w:p>
+            <w:r>
+              <w:rPr>
+                <w:b w:val="false"/>
+                <w:bCs w:val="false"/>
+                <w:i w:val="false"/>
+                <w:iCs w:val="false"/>
+                <w:color w:val="000000"/>
+                <w:sz w:val="19"/>
+                <w:szCs w:val="19"/>
+              </w:rPr>
+              <w:t xml:space="preserve">Git log only (developer-readable)</w:t>
+            </w:r>
+          </w:p>
+        </w:tc>
+        <w:tc>
+          <w:tcPr>
+            <w:tcW w:type="dxa" w:w="1750"/>
+            <w:shd w:fill="f2f2f2" w:val="clear"/>
+            <w:tcMar>
+              <w:top w:type="dxa" w:w="80"/>
+              <w:left w:type="dxa" w:w="100"/>
+              <w:bottom w:type="dxa" w:w="80"/>
+              <w:right w:type="dxa" w:w="100"/>
+            </w:tcMar>
+          </w:tcPr>
+          <w:p>
+            <w:r>
+              <w:rPr>
+                <w:b w:val="false"/>
+                <w:bCs w:val="false"/>
+                <w:i w:val="false"/>
+                <w:iCs w:val="false"/>
+                <w:color w:val="000000"/>
+                <w:sz w:val="19"/>
+                <w:szCs w:val="19"/>
+              </w:rPr>
+              <w:t xml:space="preserve">Same</w:t>
+            </w:r>
+          </w:p>
+        </w:tc>
+        <w:tc>
+          <w:tcPr>
+            <w:tcW w:type="dxa" w:w="1750"/>
+            <w:shd w:fill="f2f2f2" w:val="clear"/>
+            <w:tcMar>
+              <w:top w:type="dxa" w:w="80"/>
+              <w:left w:type="dxa" w:w="100"/>
+              <w:bottom w:type="dxa" w:w="80"/>
+              <w:right w:type="dxa" w:w="100"/>
+            </w:tcMar>
+          </w:tcPr>
+          <w:p>
+            <w:r>
+              <w:rPr>
+                <w:b w:val="false"/>
+                <w:bCs w:val="false"/>
+                <w:i w:val="false"/>
+                <w:iCs w:val="false"/>
+                <w:color w:val="000000"/>
+                <w:sz w:val="19"/>
+                <w:szCs w:val="19"/>
+              </w:rPr>
+              <w:t xml:space="preserve">In-CMS activity feed</w:t>
+            </w:r>
+          </w:p>
+        </w:tc>
+        <w:tc>
+          <w:tcPr>
+            <w:tcW w:type="dxa" w:w="2350"/>
+            <w:shd w:fill="f2f2f2" w:val="clear"/>
+            <w:tcMar>
+              <w:top w:type="dxa" w:w="80"/>
+              <w:left w:type="dxa" w:w="100"/>
+              <w:bottom w:type="dxa" w:w="80"/>
+              <w:right w:type="dxa" w:w="100"/>
+            </w:tcMar>
+          </w:tcPr>
+          <w:p>
+            <w:r>
+              <w:rPr>
+                <w:b w:val="false"/>
+                <w:bCs w:val="false"/>
+                <w:i w:val="false"/>
+                <w:iCs w:val="false"/>
+                <w:color w:val="000000"/>
+                <w:sz w:val="19"/>
+                <w:szCs w:val="19"/>
+              </w:rPr>
+              <w:t xml:space="preserve">Native, searchable</w:t>
+            </w:r>
+          </w:p>
+        </w:tc>
+      </w:tr>
+      <w:tr>
+        <w:tc>
+          <w:tcPr>
+            <w:tcW w:type="dxa" w:w="1900"/>
+            <w:tcMar>
+              <w:top w:type="dxa" w:w="80"/>
+              <w:left w:type="dxa" w:w="100"/>
+              <w:bottom w:type="dxa" w:w="80"/>
+              <w:right w:type="dxa" w:w="100"/>
+            </w:tcMar>
+          </w:tcPr>
+          <w:p>
+            <w:r>
+              <w:rPr>
+                <w:b w:val="false"/>
+                <w:bCs w:val="false"/>
+                <w:i w:val="false"/>
+                <w:iCs w:val="false"/>
+                <w:color w:val="000000"/>
+                <w:sz w:val="19"/>
+                <w:szCs w:val="19"/>
+              </w:rPr>
+              <w:t xml:space="preserve">Media/image governance</w:t>
+            </w:r>
+          </w:p>
+        </w:tc>
+        <w:tc>
+          <w:tcPr>
+            <w:tcW w:type="dxa" w:w="1750"/>
+            <w:tcMar>
+              <w:top w:type="dxa" w:w="80"/>
+              <w:left w:type="dxa" w:w="100"/>
+              <w:bottom w:type="dxa" w:w="80"/>
+              <w:right w:type="dxa" w:w="100"/>
+            </w:tcMar>
+          </w:tcPr>
+          <w:p>
+            <w:r>
+              <w:rPr>
+                <w:b w:val="false"/>
+                <w:bCs w:val="false"/>
+                <w:i w:val="false"/>
+                <w:iCs w:val="false"/>
+                <w:color w:val="000000"/>
+                <w:sz w:val="19"/>
+                <w:szCs w:val="19"/>
+              </w:rPr>
+              <w:t xml:space="preserve">None — any file, any size</w:t>
+            </w:r>
+          </w:p>
+        </w:tc>
+        <w:tc>
+          <w:tcPr>
+            <w:tcW w:type="dxa" w:w="1750"/>
+            <w:tcMar>
+              <w:top w:type="dxa" w:w="80"/>
+              <w:left w:type="dxa" w:w="100"/>
+              <w:bottom w:type="dxa" w:w="80"/>
+              <w:right w:type="dxa" w:w="100"/>
+            </w:tcMar>
+          </w:tcPr>
+          <w:p>
+            <w:r>
+              <w:rPr>
+                <w:b w:val="false"/>
+                <w:bCs w:val="false"/>
+                <w:i w:val="false"/>
+                <w:iCs w:val="false"/>
+                <w:color w:val="000000"/>
+                <w:sz w:val="19"/>
+                <w:szCs w:val="19"/>
+              </w:rPr>
+              <w:t xml:space="preserve">Auto-WebP + size budget on merge</w:t>
+            </w:r>
+          </w:p>
+        </w:tc>
+        <w:tc>
+          <w:tcPr>
+            <w:tcW w:type="dxa" w:w="1750"/>
+            <w:tcMar>
+              <w:top w:type="dxa" w:w="80"/>
+              <w:left w:type="dxa" w:w="100"/>
+              <w:bottom w:type="dxa" w:w="80"/>
+              <w:right w:type="dxa" w:w="100"/>
+            </w:tcMar>
+          </w:tcPr>
+          <w:p>
+            <w:r>
+              <w:rPr>
+                <w:b w:val="false"/>
+                <w:bCs w:val="false"/>
+                <w:i w:val="false"/>
+                <w:iCs w:val="false"/>
+                <w:color w:val="000000"/>
+                <w:sz w:val="19"/>
+                <w:szCs w:val="19"/>
+              </w:rPr>
+              <w:t xml:space="preserve">Same</w:t>
+            </w:r>
+          </w:p>
+        </w:tc>
+        <w:tc>
+          <w:tcPr>
+            <w:tcW w:type="dxa" w:w="2350"/>
+            <w:tcMar>
+              <w:top w:type="dxa" w:w="80"/>
+              <w:left w:type="dxa" w:w="100"/>
+              <w:bottom w:type="dxa" w:w="80"/>
+              <w:right w:type="dxa" w:w="100"/>
+            </w:tcMar>
+          </w:tcPr>
+          <w:p>
+            <w:r>
+              <w:rPr>
+                <w:b w:val="false"/>
+                <w:bCs w:val="false"/>
+                <w:i w:val="false"/>
+                <w:iCs w:val="false"/>
+                <w:color w:val="000000"/>
+                <w:sz w:val="19"/>
+                <w:szCs w:val="19"/>
+              </w:rPr>
+              <w:t xml:space="preserve">Native asset pipeline</w:t>
+            </w:r>
+          </w:p>
+        </w:tc>
+      </w:tr>
+      <w:tr>
+        <w:tc>
+          <w:tcPr>
+            <w:tcW w:type="dxa" w:w="1900"/>
+            <w:shd w:fill="f2f2f2" w:val="clear"/>
+            <w:tcMar>
+              <w:top w:type="dxa" w:w="80"/>
+              <w:left w:type="dxa" w:w="100"/>
+              <w:bottom w:type="dxa" w:w="80"/>
+              <w:right w:type="dxa" w:w="100"/>
+            </w:tcMar>
+          </w:tcPr>
+          <w:p>
+            <w:r>
+              <w:rPr>
+                <w:b w:val="false"/>
+                <w:bCs w:val="false"/>
+                <w:i w:val="false"/>
+                <w:iCs w:val="false"/>
+                <w:color w:val="000000"/>
+                <w:sz w:val="19"/>
+                <w:szCs w:val="19"/>
+              </w:rPr>
+              <w:t xml:space="preserve">Scheduled publishing</w:t>
+            </w:r>
+          </w:p>
+        </w:tc>
+        <w:tc>
+          <w:tcPr>
+            <w:tcW w:type="dxa" w:w="1750"/>
+            <w:shd w:fill="f2f2f2" w:val="clear"/>
+            <w:tcMar>
+              <w:top w:type="dxa" w:w="80"/>
+              <w:left w:type="dxa" w:w="100"/>
+              <w:bottom w:type="dxa" w:w="80"/>
+              <w:right w:type="dxa" w:w="100"/>
+            </w:tcMar>
+          </w:tcPr>
+          <w:p>
+            <w:r>
+              <w:rPr>
+                <w:b w:val="false"/>
+                <w:bCs w:val="false"/>
+                <w:i w:val="false"/>
+                <w:iCs w:val="false"/>
+                <w:color w:val="000000"/>
+                <w:sz w:val="19"/>
+                <w:szCs w:val="19"/>
+              </w:rPr>
+              <w:t xml:space="preserve">Not supported</w:t>
+            </w:r>
+          </w:p>
+        </w:tc>
+        <w:tc>
+          <w:tcPr>
+            <w:tcW w:type="dxa" w:w="1750"/>
+            <w:shd w:fill="f2f2f2" w:val="clear"/>
+            <w:tcMar>
+              <w:top w:type="dxa" w:w="80"/>
+              <w:left w:type="dxa" w:w="100"/>
+              <w:bottom w:type="dxa" w:w="80"/>
+              <w:right w:type="dxa" w:w="100"/>
+            </w:tcMar>
+          </w:tcPr>
+          <w:p>
+            <w:r>
+              <w:rPr>
+                <w:b w:val="false"/>
+                <w:bCs w:val="false"/>
+                <w:i w:val="false"/>
+                <w:iCs w:val="false"/>
+                <w:color w:val="000000"/>
+                <w:sz w:val="19"/>
+                <w:szCs w:val="19"/>
+              </w:rPr>
+              <w:t xml:space="preserve">Not yet</w:t>
+            </w:r>
+          </w:p>
+        </w:tc>
+        <w:tc>
+          <w:tcPr>
+            <w:tcW w:type="dxa" w:w="1750"/>
+            <w:shd w:fill="f2f2f2" w:val="clear"/>
+            <w:tcMar>
+              <w:top w:type="dxa" w:w="80"/>
+              <w:left w:type="dxa" w:w="100"/>
+              <w:bottom w:type="dxa" w:w="80"/>
+              <w:right w:type="dxa" w:w="100"/>
+            </w:tcMar>
+          </w:tcPr>
+          <w:p>
+            <w:r>
+              <w:rPr>
+                <w:b w:val="false"/>
+                <w:bCs w:val="false"/>
+                <w:i w:val="false"/>
+                <w:iCs w:val="false"/>
+                <w:color w:val="000000"/>
+                <w:sz w:val="19"/>
+                <w:szCs w:val="19"/>
+              </w:rPr>
+              <w:t xml:space="preserve">Date-gated GitHub Action</w:t>
+            </w:r>
+          </w:p>
+        </w:tc>
+        <w:tc>
+          <w:tcPr>
+            <w:tcW w:type="dxa" w:w="2350"/>
+            <w:shd w:fill="f2f2f2" w:val="clear"/>
+            <w:tcMar>
+              <w:top w:type="dxa" w:w="80"/>
+              <w:left w:type="dxa" w:w="100"/>
+              <w:bottom w:type="dxa" w:w="80"/>
+              <w:right w:type="dxa" w:w="100"/>
+            </w:tcMar>
+          </w:tcPr>
+          <w:p>
+            <w:r>
+              <w:rPr>
+                <w:b w:val="false"/>
+                <w:bCs w:val="false"/>
+                <w:i w:val="false"/>
+                <w:iCs w:val="false"/>
+                <w:color w:val="000000"/>
+                <w:sz w:val="19"/>
+                <w:szCs w:val="19"/>
+              </w:rPr>
+              <w:t xml:space="preserve">Native</w:t>
+            </w:r>
+          </w:p>
+        </w:tc>
+      </w:tr>
+      <w:tr>
+        <w:tc>
+          <w:tcPr>
+            <w:tcW w:type="dxa" w:w="1900"/>
+            <w:tcMar>
+              <w:top w:type="dxa" w:w="80"/>
+              <w:left w:type="dxa" w:w="100"/>
+              <w:bottom w:type="dxa" w:w="80"/>
+              <w:right w:type="dxa" w:w="100"/>
+            </w:tcMar>
+          </w:tcPr>
+          <w:p>
+            <w:r>
+              <w:rPr>
+                <w:b w:val="false"/>
+                <w:bCs w:val="false"/>
+                <w:i w:val="false"/>
+                <w:iCs w:val="false"/>
+                <w:color w:val="000000"/>
+                <w:sz w:val="19"/>
+                <w:szCs w:val="19"/>
+              </w:rPr>
+              <w:t xml:space="preserve">Dashboard / site health</w:t>
+            </w:r>
+          </w:p>
+        </w:tc>
+        <w:tc>
+          <w:tcPr>
+            <w:tcW w:type="dxa" w:w="1750"/>
+            <w:tcMar>
+              <w:top w:type="dxa" w:w="80"/>
+              <w:left w:type="dxa" w:w="100"/>
+              <w:bottom w:type="dxa" w:w="80"/>
+              <w:right w:type="dxa" w:w="100"/>
+            </w:tcMar>
+          </w:tcPr>
+          <w:p>
+            <w:r>
+              <w:rPr>
+                <w:b w:val="false"/>
+                <w:bCs w:val="false"/>
+                <w:i w:val="false"/>
+                <w:iCs w:val="false"/>
+                <w:color w:val="000000"/>
+                <w:sz w:val="19"/>
+                <w:szCs w:val="19"/>
+              </w:rPr>
+              <w:t xml:space="preserve">None</w:t>
+            </w:r>
+          </w:p>
+        </w:tc>
+        <w:tc>
+          <w:tcPr>
+            <w:tcW w:type="dxa" w:w="1750"/>
+            <w:tcMar>
+              <w:top w:type="dxa" w:w="80"/>
+              <w:left w:type="dxa" w:w="100"/>
+              <w:bottom w:type="dxa" w:w="80"/>
+              <w:right w:type="dxa" w:w="100"/>
+            </w:tcMar>
+          </w:tcPr>
+          <w:p>
+            <w:r>
+              <w:rPr>
+                <w:b w:val="false"/>
+                <w:bCs w:val="false"/>
+                <w:i w:val="false"/>
+                <w:iCs w:val="false"/>
+                <w:color w:val="000000"/>
+                <w:sz w:val="19"/>
+                <w:szCs w:val="19"/>
+              </w:rPr>
+              <w:t xml:space="preserve">None</w:t>
+            </w:r>
+          </w:p>
+        </w:tc>
+        <w:tc>
+          <w:tcPr>
+            <w:tcW w:type="dxa" w:w="1750"/>
+            <w:tcMar>
+              <w:top w:type="dxa" w:w="80"/>
+              <w:left w:type="dxa" w:w="100"/>
+              <w:bottom w:type="dxa" w:w="80"/>
+              <w:right w:type="dxa" w:w="100"/>
+            </w:tcMar>
+          </w:tcPr>
+          <w:p>
+            <w:r>
+              <w:rPr>
+                <w:b w:val="false"/>
+                <w:bCs w:val="false"/>
+                <w:i w:val="false"/>
+                <w:iCs w:val="false"/>
+                <w:color w:val="000000"/>
+                <w:sz w:val="19"/>
+                <w:szCs w:val="19"/>
+              </w:rPr>
+              <w:t xml:space="preserve">Custom Admin Home screen</w:t>
+            </w:r>
+          </w:p>
+        </w:tc>
+        <w:tc>
+          <w:tcPr>
+            <w:tcW w:type="dxa" w:w="2350"/>
+            <w:tcMar>
+              <w:top w:type="dxa" w:w="80"/>
+              <w:left w:type="dxa" w:w="100"/>
+              <w:bottom w:type="dxa" w:w="80"/>
+              <w:right w:type="dxa" w:w="100"/>
+            </w:tcMar>
+          </w:tcPr>
+          <w:p>
+            <w:r>
+              <w:rPr>
+                <w:b w:val="false"/>
+                <w:bCs w:val="false"/>
+                <w:i w:val="false"/>
+                <w:iCs w:val="false"/>
+                <w:color w:val="000000"/>
+                <w:sz w:val="19"/>
+                <w:szCs w:val="19"/>
+              </w:rPr>
+              <w:t xml:space="preserve">Native</w:t>
+            </w:r>
+          </w:p>
+        </w:tc>
+      </w:tr>
+      <w:tr>
+        <w:tc>
+          <w:tcPr>
+            <w:tcW w:type="dxa" w:w="1900"/>
+            <w:shd w:fill="f2f2f2" w:val="clear"/>
+            <w:tcMar>
+              <w:top w:type="dxa" w:w="80"/>
+              <w:left w:type="dxa" w:w="100"/>
+              <w:bottom w:type="dxa" w:w="80"/>
+              <w:right w:type="dxa" w:w="100"/>
+            </w:tcMar>
+          </w:tcPr>
+          <w:p>
+            <w:r>
+              <w:rPr>
+                <w:b w:val="false"/>
+                <w:bCs w:val="false"/>
+                <w:i w:val="false"/>
+                <w:iCs w:val="false"/>
+                <w:color w:val="000000"/>
+                <w:sz w:val="19"/>
+                <w:szCs w:val="19"/>
+              </w:rPr>
+              <w:t xml:space="preserve">New infrastructure required</w:t>
+            </w:r>
+          </w:p>
+        </w:tc>
+        <w:tc>
+          <w:tcPr>
+            <w:tcW w:type="dxa" w:w="1750"/>
+            <w:shd w:fill="f2f2f2" w:val="clear"/>
+            <w:tcMar>
+              <w:top w:type="dxa" w:w="80"/>
+              <w:left w:type="dxa" w:w="100"/>
+              <w:bottom w:type="dxa" w:w="80"/>
+              <w:right w:type="dxa" w:w="100"/>
+            </w:tcMar>
+          </w:tcPr>
+          <w:p>
+            <w:r>
+              <w:rPr>
+                <w:b w:val="false"/>
+                <w:bCs w:val="false"/>
+                <w:i w:val="false"/>
+                <w:iCs w:val="false"/>
+                <w:color w:val="000000"/>
+                <w:sz w:val="19"/>
+                <w:szCs w:val="19"/>
+              </w:rPr>
+              <w:t xml:space="preserve">None (current state)</w:t>
+            </w:r>
+          </w:p>
+        </w:tc>
+        <w:tc>
+          <w:tcPr>
+            <w:tcW w:type="dxa" w:w="1750"/>
+            <w:shd w:fill="f2f2f2" w:val="clear"/>
+            <w:tcMar>
+              <w:top w:type="dxa" w:w="80"/>
+              <w:left w:type="dxa" w:w="100"/>
+              <w:bottom w:type="dxa" w:w="80"/>
+              <w:right w:type="dxa" w:w="100"/>
+            </w:tcMar>
+          </w:tcPr>
+          <w:p>
+            <w:r>
+              <w:rPr>
+                <w:b w:val="false"/>
+                <w:bCs w:val="false"/>
+                <w:i w:val="false"/>
+                <w:iCs w:val="false"/>
+                <w:color w:val="000000"/>
+                <w:sz w:val="19"/>
+                <w:szCs w:val="19"/>
+              </w:rPr>
+              <w:t xml:space="preserve">None — config only</w:t>
+            </w:r>
+          </w:p>
+        </w:tc>
+        <w:tc>
+          <w:tcPr>
+            <w:tcW w:type="dxa" w:w="1750"/>
+            <w:shd w:fill="f2f2f2" w:val="clear"/>
+            <w:tcMar>
+              <w:top w:type="dxa" w:w="80"/>
+              <w:left w:type="dxa" w:w="100"/>
+              <w:bottom w:type="dxa" w:w="80"/>
+              <w:right w:type="dxa" w:w="100"/>
+            </w:tcMar>
+          </w:tcPr>
+          <w:p>
+            <w:r>
+              <w:rPr>
+                <w:b w:val="false"/>
+                <w:bCs w:val="false"/>
+                <w:i w:val="false"/>
+                <w:iCs w:val="false"/>
+                <w:color w:val="000000"/>
+                <w:sz w:val="19"/>
+                <w:szCs w:val="19"/>
+              </w:rPr>
+              <w:t xml:space="preserve">None — static + Actions</w:t>
+            </w:r>
+          </w:p>
+        </w:tc>
+        <w:tc>
+          <w:tcPr>
+            <w:tcW w:type="dxa" w:w="2350"/>
+            <w:shd w:fill="f2f2f2" w:val="clear"/>
+            <w:tcMar>
+              <w:top w:type="dxa" w:w="80"/>
+              <w:left w:type="dxa" w:w="100"/>
+              <w:bottom w:type="dxa" w:w="80"/>
+              <w:right w:type="dxa" w:w="100"/>
+            </w:tcMar>
+          </w:tcPr>
+          <w:p>
+            <w:r>
+              <w:rPr>
+                <w:b w:val="false"/>
+                <w:bCs w:val="false"/>
+                <w:i w:val="false"/>
+                <w:iCs w:val="false"/>
+                <w:color w:val="000000"/>
+                <w:sz w:val="19"/>
+                <w:szCs w:val="19"/>
+              </w:rPr>
+              <w:t xml:space="preserve">Server + database</w:t>
+            </w:r>
+          </w:p>
+        </w:tc>
+      </w:tr>
+    </w:tbl>
+    <w:p>
+      <w:pPr>
+        <w:spacing w:after="80"/>
+      </w:pPr>
+      <w:r>
+        <w:t xml:space="preserve"/>
+      </w:r>
+    </w:p>
+    <w:p>
+      <w:pPr>
+        <w:pStyle w:val="Heading2"/>
+      </w:pPr>
+      <w:r>
+        <w:t xml:space="preserve">8.3 Recommendation</w:t>
+      </w:r>
+    </w:p>
+    <w:p>
+      <w:pPr>
+        <w:spacing w:after="160"/>
+      </w:pPr>
+      <w:r>
+        <w:t xml:space="preserve">Start Phase A immediately — it is configuration, not code, and pairs naturally with the Phase 0/Phase 1 work in Section 7. Plan Phase B alongside the Section 7.3 structural migration, since both touch the same underlying content system and are natural to sequence together. Treat Phase C as a later, needs-driven decision rather than a default target: "enterprise-grade" administration means matching real editorial risk controls — who can publish what, with what review, and with what record — to the institution's actual size and workflow, not acquiring the most tooling available.</w:t>
+      </w:r>
+    </w:p>
+    <w:p>
+      <w:pPr>
+        <w:pStyle w:val="Heading1"/>
+      </w:pPr>
+      <w:r>
+        <w:t xml:space="preserve">9. Bottom line</w:t>
+      </w:r>
+    </w:p>
+    <w:p>
+      <w:pPr>
+        <w:spacing w:after="160"/>
+      </w:pPr>
+      <w:r>
+        <w:t xml:space="preserve">Nothing found here requires abandoning the current static-HTML-on-GitHub-Pages approach, and most of Phase 0 can be done in a single sitting with no deployment risk. The highest-leverage single action is image compression — it is responsible for roughly 85% of the page's weight and needs no code restructuring at all. The highest-leverage structural action, once time allows, is moving off 80 copy-pasted HTML files onto shared templates — every bug this session had to hand-fix across 47+ files traces back to that one decision, and fixing it prevents the next several bugs like it rather than reacting to them one at a time. On the admin side, the highest-leverage single action is just as cheap: turning on Decap's editorial workflow is a one-line config change that converts "anyone with access can publish anything instantly" into an actual review step, without touching the site's architecture at all.</w:t>
       </w:r>
     </w:p>
     <w:sectPr>

</xml_diff>